<commit_message>
Example 2 updated to the new standards
</commit_message>
<xml_diff>
--- a/Manual/User_Manual.docx
+++ b/Manual/User_Manual.docx
@@ -1371,23 +1371,7 @@
                 <w:noProof/>
                 <w:lang w:val="it-IT"/>
               </w:rPr>
-              <w:t>5.1 Example 1: Solfata</w:t>
-            </w:r>
-            <w:r>
-              <w:rPr>
-                <w:rStyle w:val="Hyperlink"/>
-                <w:noProof/>
-                <w:lang w:val="it-IT"/>
-              </w:rPr>
-              <w:t>r</w:t>
-            </w:r>
-            <w:r>
-              <w:rPr>
-                <w:rStyle w:val="Hyperlink"/>
-                <w:noProof/>
-                <w:lang w:val="it-IT"/>
-              </w:rPr>
-              <w:t>a volcano (Campi Flegrei, Italy)</w:t>
+              <w:t>5.1 Example 1: Solfatara volcano (Campi Flegrei, Italy)</w:t>
             </w:r>
             <w:r>
               <w:rPr>
@@ -14010,7 +13994,19 @@
         <w:rPr>
           <w:rFonts w:asciiTheme="majorHAnsi" w:hAnsiTheme="majorHAnsi" w:cstheme="majorHAnsi"/>
         </w:rPr>
-        <w:t>-S 01/01/1992 -E 01/01/2022 -V 360060 -NS 100 -ERA5 True -N 10 -DG on</w:t>
+        <w:t>-S 01/01/1992 -E 01/01/202</w:t>
+      </w:r>
+      <w:r>
+        <w:rPr>
+          <w:rFonts w:asciiTheme="majorHAnsi" w:hAnsiTheme="majorHAnsi" w:cstheme="majorHAnsi"/>
+        </w:rPr>
+        <w:t>5</w:t>
+      </w:r>
+      <w:r>
+        <w:rPr>
+          <w:rFonts w:asciiTheme="majorHAnsi" w:hAnsiTheme="majorHAnsi" w:cstheme="majorHAnsi"/>
+        </w:rPr>
+        <w:t xml:space="preserve"> -V 360060 -NS 100 -ERA5 True -N 10 -DG on</w:t>
       </w:r>
     </w:p>
     <w:p>
@@ -14075,7 +14071,10 @@
         <w:t>/20</w:t>
       </w:r>
       <w:r>
-        <w:t>22</w:t>
+        <w:t>2</w:t>
+      </w:r>
+      <w:r>
+        <w:t>5</w:t>
       </w:r>
       <w:r>
         <w:t xml:space="preserve"> </w:t>
@@ -14087,7 +14086,13 @@
         <w:rPr>
           <w:rFonts w:asciiTheme="majorHAnsi" w:hAnsiTheme="majorHAnsi" w:cstheme="majorHAnsi"/>
         </w:rPr>
-        <w:t>-S 01/01/1992 -E 01/01/2022</w:t>
+        <w:t>-S 01/01/1992 -E 01/01/202</w:t>
+      </w:r>
+      <w:r>
+        <w:rPr>
+          <w:rFonts w:asciiTheme="majorHAnsi" w:hAnsiTheme="majorHAnsi" w:cstheme="majorHAnsi"/>
+        </w:rPr>
+        <w:t>5</w:t>
       </w:r>
       <w:r>
         <w:t>)</w:t>
@@ -14538,83 +14543,71 @@
         <w:rPr>
           <w:rFonts w:asciiTheme="majorHAnsi" w:hAnsiTheme="majorHAnsi" w:cstheme="majorHAnsi"/>
         </w:rPr>
+        <w:t>../../../</w:t>
+      </w:r>
+      <w:r>
+        <w:t xml:space="preserve"> </w:t>
+      </w:r>
+      <w:r>
+        <w:rPr>
+          <w:rFonts w:asciiTheme="majorHAnsi" w:hAnsiTheme="majorHAnsi" w:cstheme="majorHAnsi"/>
+        </w:rPr>
+        <w:t>run_models.py -N 100 -RS True -NS 5 -SINT 2,5 -D UTM,1774000,642900,1775995,645390 -NX 166 -NY 133 -RER True -PDEM ecdf -TS H2O -DM disgas -OH 0,1,2,4,10,20,30</w:t>
+      </w:r>
+    </w:p>
+    <w:p>
+      <w:pPr>
+        <w:rPr>
+          <w:rFonts w:asciiTheme="majorHAnsi" w:hAnsiTheme="majorHAnsi" w:cstheme="majorHAnsi"/>
+        </w:rPr>
+      </w:pPr>
+      <w:r>
+        <w:rPr>
+          <w:rFonts w:cs="Times New Roman"/>
+        </w:rPr>
+        <w:t xml:space="preserve">Case 2b: </w:t>
+      </w:r>
+      <w:r>
+        <w:rPr>
+          <w:rFonts w:asciiTheme="majorHAnsi" w:hAnsiTheme="majorHAnsi" w:cstheme="majorHAnsi"/>
+        </w:rPr>
+        <w:t xml:space="preserve">python </w:t>
+      </w:r>
+      <w:r>
+        <w:rPr>
+          <w:rFonts w:asciiTheme="majorHAnsi" w:hAnsiTheme="majorHAnsi" w:cstheme="majorHAnsi"/>
+        </w:rPr>
         <w:t xml:space="preserve">../../../run_models.py </w:t>
       </w:r>
       <w:r>
         <w:rPr>
           <w:rFonts w:asciiTheme="majorHAnsi" w:hAnsiTheme="majorHAnsi" w:cstheme="majorHAnsi"/>
         </w:rPr>
-        <w:t xml:space="preserve">-N 100 -RS on -NS 5 -SINT 2,5 -D UTM,1774000,642900,1775995,645390 -NX 166 -NY 133 -RER </w:t>
-      </w:r>
-      <w:r>
-        <w:rPr>
-          <w:rFonts w:asciiTheme="majorHAnsi" w:hAnsiTheme="majorHAnsi" w:cstheme="majorHAnsi"/>
-        </w:rPr>
-        <w:t>on</w:t>
-      </w:r>
-      <w:r>
-        <w:rPr>
-          <w:rFonts w:asciiTheme="majorHAnsi" w:hAnsiTheme="majorHAnsi" w:cstheme="majorHAnsi"/>
-        </w:rPr>
-        <w:t xml:space="preserve"> -PDEM ecdf</w:t>
-      </w:r>
-      <w:r>
+        <w:t xml:space="preserve">-N 1 -RS </w:t>
+      </w:r>
+      <w:r>
+        <w:rPr>
+          <w:rFonts w:asciiTheme="majorHAnsi" w:hAnsiTheme="majorHAnsi" w:cstheme="majorHAnsi"/>
+        </w:rPr>
+        <w:t>True</w:t>
+      </w:r>
+      <w:r>
+        <w:rPr>
+          <w:rFonts w:asciiTheme="majorHAnsi" w:hAnsiTheme="majorHAnsi" w:cstheme="majorHAnsi"/>
+        </w:rPr>
+        <w:t xml:space="preserve"> -NS 5 -SINT 2,5 -D UTM,1774000,642900,1775995,645390 -NX 166 -NY 133 -RER </w:t>
+      </w:r>
+      <w:r>
+        <w:rPr>
+          <w:rFonts w:asciiTheme="majorHAnsi" w:hAnsiTheme="majorHAnsi" w:cstheme="majorHAnsi"/>
+        </w:rPr>
+        <w:t>True</w:t>
+      </w:r>
+      <w:r>
+        <w:rPr>
+          <w:rFonts w:asciiTheme="majorHAnsi" w:hAnsiTheme="majorHAnsi" w:cstheme="majorHAnsi"/>
+        </w:rPr>
         <w:t xml:space="preserve"> </w:t>
-      </w:r>
-      <w:r>
-        <w:rPr>
-          <w:rFonts w:asciiTheme="majorHAnsi" w:hAnsiTheme="majorHAnsi" w:cstheme="majorHAnsi"/>
-        </w:rPr>
-        <w:t>-TS H2O</w:t>
-      </w:r>
-      <w:r>
-        <w:rPr>
-          <w:rFonts w:asciiTheme="majorHAnsi" w:hAnsiTheme="majorHAnsi" w:cstheme="majorHAnsi"/>
-        </w:rPr>
-        <w:t xml:space="preserve"> -DM disgas</w:t>
-      </w:r>
-      <w:r>
-        <w:rPr>
-          <w:rFonts w:asciiTheme="majorHAnsi" w:hAnsiTheme="majorHAnsi" w:cstheme="majorHAnsi"/>
-        </w:rPr>
-        <w:t xml:space="preserve"> </w:t>
-      </w:r>
-      <w:r>
-        <w:rPr>
-          <w:rFonts w:asciiTheme="majorHAnsi" w:hAnsiTheme="majorHAnsi" w:cstheme="majorHAnsi"/>
-        </w:rPr>
-        <w:t>-OH 0,1,2,4,10,20,30</w:t>
-      </w:r>
-    </w:p>
-    <w:p>
-      <w:pPr>
-        <w:rPr>
-          <w:rFonts w:asciiTheme="majorHAnsi" w:hAnsiTheme="majorHAnsi" w:cstheme="majorHAnsi"/>
-        </w:rPr>
-      </w:pPr>
-      <w:r>
-        <w:rPr>
-          <w:rFonts w:cs="Times New Roman"/>
-        </w:rPr>
-        <w:t xml:space="preserve">Case 2b: </w:t>
-      </w:r>
-      <w:r>
-        <w:rPr>
-          <w:rFonts w:asciiTheme="majorHAnsi" w:hAnsiTheme="majorHAnsi" w:cstheme="majorHAnsi"/>
-        </w:rPr>
-        <w:t xml:space="preserve">python </w:t>
-      </w:r>
-      <w:r>
-        <w:rPr>
-          <w:rFonts w:asciiTheme="majorHAnsi" w:hAnsiTheme="majorHAnsi" w:cstheme="majorHAnsi"/>
-        </w:rPr>
-        <w:t xml:space="preserve">../../../run_models.py </w:t>
-      </w:r>
-      <w:r>
-        <w:rPr>
-          <w:rFonts w:asciiTheme="majorHAnsi" w:hAnsiTheme="majorHAnsi" w:cstheme="majorHAnsi"/>
-        </w:rPr>
-        <w:t xml:space="preserve">-N 1 -RS on -NS 5 -SINT 2,5 -D UTM,1774000,642900,1775995,645390 -NX 166 -NY 133 -RER on </w:t>
       </w:r>
       <w:r>
         <w:rPr>
@@ -14793,13 +14786,31 @@
         <w:rPr>
           <w:rFonts w:asciiTheme="majorHAnsi" w:hAnsiTheme="majorHAnsi" w:cstheme="majorHAnsi"/>
         </w:rPr>
-        <w:t>-RS on -NS 5</w:t>
-      </w:r>
-      <w:r>
-        <w:rPr>
-          <w:rFonts w:asciiTheme="majorHAnsi" w:hAnsiTheme="majorHAnsi" w:cstheme="majorHAnsi"/>
-        </w:rPr>
-        <w:t xml:space="preserve"> … -RER on</w:t>
+        <w:t xml:space="preserve">-RS </w:t>
+      </w:r>
+      <w:r>
+        <w:rPr>
+          <w:rFonts w:asciiTheme="majorHAnsi" w:hAnsiTheme="majorHAnsi" w:cstheme="majorHAnsi"/>
+        </w:rPr>
+        <w:t>True</w:t>
+      </w:r>
+      <w:r>
+        <w:rPr>
+          <w:rFonts w:asciiTheme="majorHAnsi" w:hAnsiTheme="majorHAnsi" w:cstheme="majorHAnsi"/>
+        </w:rPr>
+        <w:t xml:space="preserve"> -NS 5</w:t>
+      </w:r>
+      <w:r>
+        <w:rPr>
+          <w:rFonts w:asciiTheme="majorHAnsi" w:hAnsiTheme="majorHAnsi" w:cstheme="majorHAnsi"/>
+        </w:rPr>
+        <w:t xml:space="preserve"> … -RER </w:t>
+      </w:r>
+      <w:r>
+        <w:rPr>
+          <w:rFonts w:asciiTheme="majorHAnsi" w:hAnsiTheme="majorHAnsi" w:cstheme="majorHAnsi"/>
+        </w:rPr>
+        <w:t>True</w:t>
       </w:r>
       <w:r>
         <w:rPr>

</xml_diff>

<commit_message>
Example 3 updated to the new standards
</commit_message>
<xml_diff>
--- a/Manual/User_Manual.docx
+++ b/Manual/User_Manual.docx
@@ -16423,7 +16423,19 @@
         <w:rPr>
           <w:rFonts w:asciiTheme="majorHAnsi" w:hAnsiTheme="majorHAnsi" w:cstheme="majorHAnsi"/>
         </w:rPr>
-        <w:t>python ../../../run_models.py -N 100 -RS off -D UTM,4535600,511300,4536110,512500 -NX 400 -NY 170 -DM twodee -RD 4 -TS CO2 -OH 0.05,0.5,1.0,1.5,2.0,2.5,3.0</w:t>
+        <w:t xml:space="preserve">python ../../../run_models.py -N 100 -RS </w:t>
+      </w:r>
+      <w:r>
+        <w:rPr>
+          <w:rFonts w:asciiTheme="majorHAnsi" w:hAnsiTheme="majorHAnsi" w:cstheme="majorHAnsi"/>
+        </w:rPr>
+        <w:t>False</w:t>
+      </w:r>
+      <w:r>
+        <w:rPr>
+          <w:rFonts w:asciiTheme="majorHAnsi" w:hAnsiTheme="majorHAnsi" w:cstheme="majorHAnsi"/>
+        </w:rPr>
+        <w:t xml:space="preserve"> -D UTM,4535600,511300,4536110,512500 -NX 400 -NY 170 -DM twodee -RD 4 -TS CO2 -OH 0.05,0.5,1.0,1.5,2.0,2.5,3.0</w:t>
       </w:r>
     </w:p>
     <w:p>
@@ -16441,7 +16453,19 @@
         <w:rPr>
           <w:rFonts w:asciiTheme="majorHAnsi" w:hAnsiTheme="majorHAnsi" w:cstheme="majorHAnsi"/>
         </w:rPr>
-        <w:t>python ../../../run_models.py -N 100 -RS off -D UTM,4535600,511300,4536110,512500 -NX 400 -NY 170 -DM automatic -RD 4 -TS CO2 -OH 0.05,0.5,1.0,1.5,2.0,2.5,3.0</w:t>
+        <w:t xml:space="preserve">python ../../../run_models.py -N 100 -RS </w:t>
+      </w:r>
+      <w:r>
+        <w:rPr>
+          <w:rFonts w:asciiTheme="majorHAnsi" w:hAnsiTheme="majorHAnsi" w:cstheme="majorHAnsi"/>
+        </w:rPr>
+        <w:t>False</w:t>
+      </w:r>
+      <w:r>
+        <w:rPr>
+          <w:rFonts w:asciiTheme="majorHAnsi" w:hAnsiTheme="majorHAnsi" w:cstheme="majorHAnsi"/>
+        </w:rPr>
+        <w:t xml:space="preserve"> -D UTM,4535600,511300,4536110,512500 -NX 400 -NY 170 -DM automatic -RD 4 -TS CO2 -OH 0.05,0.5,1.0,1.5,2.0,2.5,3.0</w:t>
       </w:r>
     </w:p>
     <w:p>

</xml_diff>

<commit_message>
Implemented post processing of inversion mode runs
</commit_message>
<xml_diff>
--- a/Manual/User_Manual.docx
+++ b/Manual/User_Manual.docx
@@ -8261,11 +8261,7 @@
       <w:bookmarkEnd w:id="19"/>
       <w:bookmarkEnd w:id="20"/>
     </w:p>
-    <w:p>
-      <w:pPr>
-        <w:pStyle w:val="Heading2"/>
-      </w:pPr>
-    </w:p>
+    <w:p/>
     <w:p>
       <w:r>
         <w:t>This script is run to retrieve weather data from ERA5 archive</w:t>
@@ -13764,31 +13760,122 @@
         <w:pStyle w:val="ListParagraph"/>
         <w:rPr>
           <w:rFonts w:asciiTheme="majorHAnsi" w:hAnsiTheme="majorHAnsi" w:cstheme="majorHAnsi"/>
+        </w:rPr>
+      </w:pPr>
+      <w:r>
+        <w:rPr>
+          <w:szCs w:val="22"/>
+        </w:rPr>
+        <w:t xml:space="preserve">“True”: </w:t>
+      </w:r>
+      <w:r>
+        <w:t xml:space="preserve">Extrapolate gas concentration at locations specified in the file </w:t>
+      </w:r>
+      <w:r>
+        <w:rPr>
+          <w:rFonts w:asciiTheme="majorHAnsi" w:hAnsiTheme="majorHAnsi" w:cstheme="majorHAnsi"/>
+        </w:rPr>
+        <w:t>tracking_points.</w:t>
+      </w:r>
+      <w:r>
+        <w:rPr>
+          <w:rFonts w:asciiTheme="majorHAnsi" w:hAnsiTheme="majorHAnsi" w:cstheme="majorHAnsi"/>
+        </w:rPr>
+        <w:t>csv</w:t>
+      </w:r>
+    </w:p>
+    <w:p>
+      <w:pPr>
+        <w:pStyle w:val="ListParagraph"/>
+        <w:numPr>
+          <w:ilvl w:val="0"/>
+          <w:numId w:val="7"/>
+        </w:numPr>
+        <w:rPr>
+          <w:rFonts w:asciiTheme="majorHAnsi" w:hAnsiTheme="majorHAnsi" w:cstheme="majorHAnsi"/>
+          <w:szCs w:val="22"/>
+        </w:rPr>
+      </w:pPr>
+      <w:r>
+        <w:rPr>
+          <w:rFonts w:asciiTheme="majorHAnsi" w:hAnsiTheme="majorHAnsi" w:cstheme="majorHAnsi"/>
+          <w:szCs w:val="22"/>
+        </w:rPr>
+        <w:t>-</w:t>
+      </w:r>
+      <w:r>
+        <w:rPr>
+          <w:rFonts w:asciiTheme="majorHAnsi" w:hAnsiTheme="majorHAnsi" w:cstheme="majorHAnsi"/>
+          <w:szCs w:val="22"/>
+        </w:rPr>
+        <w:t>I</w:t>
+      </w:r>
+      <w:r>
+        <w:rPr>
+          <w:rFonts w:asciiTheme="majorHAnsi" w:hAnsiTheme="majorHAnsi" w:cstheme="majorHAnsi"/>
+          <w:szCs w:val="22"/>
+        </w:rPr>
+        <w:t xml:space="preserve"> </w:t>
+      </w:r>
+      <w:r>
+        <w:rPr>
+          <w:rFonts w:asciiTheme="majorHAnsi" w:hAnsiTheme="majorHAnsi" w:cstheme="majorHAnsi"/>
+          <w:szCs w:val="22"/>
+        </w:rPr>
+        <w:t>INVERSION</w:t>
+      </w:r>
+      <w:r>
+        <w:rPr>
+          <w:rFonts w:asciiTheme="majorHAnsi" w:hAnsiTheme="majorHAnsi" w:cstheme="majorHAnsi"/>
+          <w:szCs w:val="22"/>
+        </w:rPr>
+        <w:t>, --</w:t>
+      </w:r>
+      <w:r>
+        <w:rPr>
+          <w:rFonts w:asciiTheme="majorHAnsi" w:hAnsiTheme="majorHAnsi" w:cstheme="majorHAnsi"/>
+          <w:szCs w:val="22"/>
+        </w:rPr>
+        <w:t>inversion</w:t>
+      </w:r>
+      <w:r>
+        <w:rPr>
+          <w:rFonts w:asciiTheme="majorHAnsi" w:hAnsiTheme="majorHAnsi" w:cstheme="majorHAnsi"/>
+          <w:szCs w:val="22"/>
+        </w:rPr>
+        <w:t xml:space="preserve"> </w:t>
+      </w:r>
+      <w:r>
+        <w:rPr>
+          <w:rFonts w:asciiTheme="majorHAnsi" w:hAnsiTheme="majorHAnsi" w:cstheme="majorHAnsi"/>
+          <w:szCs w:val="22"/>
+        </w:rPr>
+        <w:t>INVERSION</w:t>
+      </w:r>
+    </w:p>
+    <w:p>
+      <w:pPr>
+        <w:pStyle w:val="ListParagraph"/>
+        <w:rPr>
+          <w:rFonts w:asciiTheme="majorHAnsi" w:hAnsiTheme="majorHAnsi" w:cstheme="majorHAnsi"/>
+        </w:rPr>
+      </w:pPr>
+      <w:r>
+        <w:rPr>
+          <w:szCs w:val="22"/>
+        </w:rPr>
+        <w:t>If True, it creates plots of the inversion runs when VIGIL is run in inversion mode.</w:t>
+      </w:r>
+    </w:p>
+    <w:p>
+      <w:pPr>
+        <w:pStyle w:val="ListParagraph"/>
+        <w:rPr>
+          <w:rFonts w:asciiTheme="majorHAnsi" w:hAnsiTheme="majorHAnsi" w:cstheme="majorHAnsi"/>
           <w:sz w:val="20"/>
           <w:szCs w:val="22"/>
         </w:rPr>
       </w:pPr>
-      <w:r>
-        <w:rPr>
-          <w:szCs w:val="22"/>
-        </w:rPr>
-        <w:t xml:space="preserve">“True”: </w:t>
-      </w:r>
-      <w:r>
-        <w:t xml:space="preserve">Extrapolate gas concentration at locations specified in the file </w:t>
-      </w:r>
-      <w:r>
-        <w:rPr>
-          <w:rFonts w:asciiTheme="majorHAnsi" w:hAnsiTheme="majorHAnsi" w:cstheme="majorHAnsi"/>
-        </w:rPr>
-        <w:t>tracking_points.</w:t>
-      </w:r>
-      <w:r>
-        <w:rPr>
-          <w:rFonts w:asciiTheme="majorHAnsi" w:hAnsiTheme="majorHAnsi" w:cstheme="majorHAnsi"/>
-        </w:rPr>
-        <w:t>csv</w:t>
-      </w:r>
     </w:p>
     <w:p>
       <w:pPr>
@@ -14242,6 +14329,7 @@
         <w:rPr>
           <w:rFonts w:asciiTheme="majorHAnsi" w:hAnsiTheme="majorHAnsi" w:cstheme="majorHAnsi"/>
         </w:rPr>
+        <w:lastRenderedPageBreak/>
         <w:t xml:space="preserve">python ../../run_models.py </w:t>
       </w:r>
       <w:r>
@@ -14295,7 +14383,6 @@
         <w:rPr>
           <w:rFonts w:cs="Times New Roman"/>
         </w:rPr>
-        <w:lastRenderedPageBreak/>
         <w:t>We finally carried out post-processing with the following command:</w:t>
       </w:r>
     </w:p>
@@ -14572,6 +14659,7 @@
         <w:rPr>
           <w:noProof/>
         </w:rPr>
+        <w:lastRenderedPageBreak/>
         <w:drawing>
           <wp:inline distT="0" distB="0" distL="0" distR="0" wp14:anchorId="11E69894" wp14:editId="43B6A396">
             <wp:extent cx="5567290" cy="5063408"/>
@@ -14823,6 +14911,7 @@
         <w:rPr>
           <w:rFonts w:asciiTheme="majorHAnsi" w:hAnsiTheme="majorHAnsi" w:cstheme="majorHAnsi"/>
         </w:rPr>
+        <w:lastRenderedPageBreak/>
         <w:t xml:space="preserve">python </w:t>
       </w:r>
       <w:r>
@@ -15606,14 +15695,7 @@
         <w:rPr>
           <w:rFonts w:cs="Times New Roman"/>
         </w:rPr>
-        <w:t xml:space="preserve"> on the data </w:t>
-      </w:r>
-      <w:r>
-        <w:rPr>
-          <w:rFonts w:cs="Times New Roman"/>
-        </w:rPr>
-        <w:lastRenderedPageBreak/>
-        <w:t xml:space="preserve">available from the literature on this observable (Massaro et al., </w:t>
+        <w:t xml:space="preserve"> on the data available from the literature on this observable (Massaro et al., </w:t>
       </w:r>
       <w:r>
         <w:rPr>
@@ -15818,6 +15900,7 @@
           <w:noProof/>
           <w:lang w:eastAsia="it-IT"/>
         </w:rPr>
+        <w:lastRenderedPageBreak/>
         <w:drawing>
           <wp:inline distT="0" distB="0" distL="0" distR="0" wp14:anchorId="5F735B5C" wp14:editId="6784D088">
             <wp:extent cx="5166360" cy="4612094"/>
@@ -16277,7 +16360,6 @@
               <w:rPr>
                 <w:b/>
               </w:rPr>
-              <w:lastRenderedPageBreak/>
               <w:t>Tracking point ID</w:t>
             </w:r>
           </w:p>
@@ -16469,6 +16551,7 @@
         <w:rPr>
           <w:noProof/>
         </w:rPr>
+        <w:lastRenderedPageBreak/>
         <w:drawing>
           <wp:inline distT="0" distB="0" distL="0" distR="0" wp14:anchorId="0AE1425C" wp14:editId="262B26B6">
             <wp:extent cx="5660723" cy="4587619"/>

</xml_diff>